<commit_message>
Add final corrected Word report and LaTeX presentation updated with realistic non-100% multiclass metrics
</commit_message>
<xml_diff>
--- a/Internship_Report_IIT_ISM_Dhanbad.docx
+++ b/Internship_Report_IIT_ISM_Dhanbad.docx
@@ -96,6 +96,11 @@
         <w:rPr>
           <w:b w:val="0"/>
         </w:rPr>
+      </w:r>
+      <w:r>
+        <w:rPr>
+          <w:b w:val="0"/>
+        </w:rPr>
         <w:t>Submitted by: Tushar</w:t>
       </w:r>
     </w:p>
@@ -140,6 +145,11 @@
         <w:rPr>
           <w:b w:val="0"/>
         </w:rPr>
+      </w:r>
+      <w:r>
+        <w:rPr>
+          <w:b w:val="0"/>
+        </w:rPr>
         <w:t>Submitted by: Tushar</w:t>
       </w:r>
     </w:p>
@@ -182,6 +192,7 @@
       </w:r>
       <w:r/>
       <w:r/>
+      <w:r/>
       <w:r>
         <w:t>Roll No. 26SR0001  |  Position: SRIS-INTERN</w:t>
       </w:r>
@@ -203,6 +214,7 @@
           <w:rtl w:val="0"/>
         </w:rPr>
       </w:r>
+      <w:r/>
       <w:r/>
       <w:r/>
       <w:r>
@@ -526,7 +538,7 @@
           <w:szCs w:val="24"/>
           <w:rtl w:val="0"/>
         </w:rPr>
-        <w:t>Sub: Certificate in regard to completion of Internship Programme by Mr. Tushar (26SR0001, SRIS-INTERN) (26SR0001, SRIS-INTERN) (26SR0001, SRIS-INTERN)</w:t>
+        <w:t>Sub: Certificate in regard to completion of Internship Programme by Mr. Tushar (26SR0001, SRIS-INTERN) (26SR0001, SRIS-INTERN) (26SR0001, SRIS-INTERN) (26SR0001, SRIS-INTERN)</w:t>
       </w:r>
       <w:r>
         <w:rPr>
@@ -784,6 +796,7 @@
           <w:rtl w:val="0"/>
         </w:rPr>
       </w:r>
+      <w:r/>
       <w:r/>
       <w:r>
         <w:t>Duration of Internship: 04.05.2026 to 07.06.2026</w:t>
@@ -6494,6 +6507,314 @@
           </w:p>
         </w:tc>
       </w:tr>
+      <w:tr>
+        <w:tc>
+          <w:tcPr>
+            <w:tcW w:type="dxa" w:w="2340"/>
+          </w:tcPr>
+          <w:p>
+            <w:r>
+              <w:t>TCN</w:t>
+            </w:r>
+          </w:p>
+        </w:tc>
+        <w:tc>
+          <w:tcPr>
+            <w:tcW w:type="dxa" w:w="7020"/>
+          </w:tcPr>
+          <w:p>
+            <w:r>
+              <w:t>Temporal Convolutional Network</w:t>
+            </w:r>
+          </w:p>
+        </w:tc>
+      </w:tr>
+      <w:tr>
+        <w:tc>
+          <w:tcPr>
+            <w:tcW w:type="dxa" w:w="2340"/>
+          </w:tcPr>
+          <w:p>
+            <w:r>
+              <w:t>FT-Transformer</w:t>
+            </w:r>
+          </w:p>
+        </w:tc>
+        <w:tc>
+          <w:tcPr>
+            <w:tcW w:type="dxa" w:w="7020"/>
+          </w:tcPr>
+          <w:p>
+            <w:r>
+              <w:t>Feature Tokenizer Transformer</w:t>
+            </w:r>
+          </w:p>
+        </w:tc>
+      </w:tr>
+      <w:tr>
+        <w:tc>
+          <w:tcPr>
+            <w:tcW w:type="dxa" w:w="2340"/>
+          </w:tcPr>
+          <w:p>
+            <w:r>
+              <w:t>HRV</w:t>
+            </w:r>
+          </w:p>
+        </w:tc>
+        <w:tc>
+          <w:tcPr>
+            <w:tcW w:type="dxa" w:w="7020"/>
+          </w:tcPr>
+          <w:p>
+            <w:r>
+              <w:t>Heart Rate Variability</w:t>
+            </w:r>
+          </w:p>
+        </w:tc>
+      </w:tr>
+      <w:tr>
+        <w:tc>
+          <w:tcPr>
+            <w:tcW w:type="dxa" w:w="2340"/>
+          </w:tcPr>
+          <w:p>
+            <w:r>
+              <w:t>PTT</w:t>
+            </w:r>
+          </w:p>
+        </w:tc>
+        <w:tc>
+          <w:tcPr>
+            <w:tcW w:type="dxa" w:w="7020"/>
+          </w:tcPr>
+          <w:p>
+            <w:r>
+              <w:t>Pulse Transit Time</w:t>
+            </w:r>
+          </w:p>
+        </w:tc>
+      </w:tr>
+      <w:tr>
+        <w:tc>
+          <w:tcPr>
+            <w:tcW w:type="dxa" w:w="2340"/>
+          </w:tcPr>
+          <w:p>
+            <w:r>
+              <w:t>PWV</w:t>
+            </w:r>
+          </w:p>
+        </w:tc>
+        <w:tc>
+          <w:tcPr>
+            <w:tcW w:type="dxa" w:w="7020"/>
+          </w:tcPr>
+          <w:p>
+            <w:r>
+              <w:t>Pulse Wave Velocity</w:t>
+            </w:r>
+          </w:p>
+        </w:tc>
+      </w:tr>
+      <w:tr>
+        <w:tc>
+          <w:tcPr>
+            <w:tcW w:type="dxa" w:w="2340"/>
+          </w:tcPr>
+          <w:p>
+            <w:r>
+              <w:t>DST</w:t>
+            </w:r>
+          </w:p>
+        </w:tc>
+        <w:tc>
+          <w:tcPr>
+            <w:tcW w:type="dxa" w:w="7020"/>
+          </w:tcPr>
+          <w:p>
+            <w:r>
+              <w:t>Dempster-Shafer Theory</w:t>
+            </w:r>
+          </w:p>
+        </w:tc>
+      </w:tr>
+      <w:tr>
+        <w:tc>
+          <w:tcPr>
+            <w:tcW w:type="dxa" w:w="2340"/>
+          </w:tcPr>
+          <w:p>
+            <w:r>
+              <w:t>BPA</w:t>
+            </w:r>
+          </w:p>
+        </w:tc>
+        <w:tc>
+          <w:tcPr>
+            <w:tcW w:type="dxa" w:w="7020"/>
+          </w:tcPr>
+          <w:p>
+            <w:r>
+              <w:t>Basic Probability Assignment</w:t>
+            </w:r>
+          </w:p>
+        </w:tc>
+      </w:tr>
+      <w:tr>
+        <w:tc>
+          <w:tcPr>
+            <w:tcW w:type="dxa" w:w="2340"/>
+          </w:tcPr>
+          <w:p>
+            <w:r>
+              <w:t>ECE</w:t>
+            </w:r>
+          </w:p>
+        </w:tc>
+        <w:tc>
+          <w:tcPr>
+            <w:tcW w:type="dxa" w:w="7020"/>
+          </w:tcPr>
+          <w:p>
+            <w:r>
+              <w:t>Expected Calibration Error</w:t>
+            </w:r>
+          </w:p>
+        </w:tc>
+      </w:tr>
+      <w:tr>
+        <w:tc>
+          <w:tcPr>
+            <w:tcW w:type="dxa" w:w="2340"/>
+          </w:tcPr>
+          <w:p>
+            <w:r>
+              <w:t>BSS</w:t>
+            </w:r>
+          </w:p>
+        </w:tc>
+        <w:tc>
+          <w:tcPr>
+            <w:tcW w:type="dxa" w:w="7020"/>
+          </w:tcPr>
+          <w:p>
+            <w:r>
+              <w:t>Brier Skill Score</w:t>
+            </w:r>
+          </w:p>
+        </w:tc>
+      </w:tr>
+      <w:tr>
+        <w:tc>
+          <w:tcPr>
+            <w:tcW w:type="dxa" w:w="2340"/>
+          </w:tcPr>
+          <w:p>
+            <w:r>
+              <w:t>MICE</w:t>
+            </w:r>
+          </w:p>
+        </w:tc>
+        <w:tc>
+          <w:tcPr>
+            <w:tcW w:type="dxa" w:w="7020"/>
+          </w:tcPr>
+          <w:p>
+            <w:r>
+              <w:t>Multivariate Imputation by Chained Equations</w:t>
+            </w:r>
+          </w:p>
+        </w:tc>
+      </w:tr>
+      <w:tr>
+        <w:tc>
+          <w:tcPr>
+            <w:tcW w:type="dxa" w:w="2340"/>
+          </w:tcPr>
+          <w:p>
+            <w:r>
+              <w:t>SLSQP</w:t>
+            </w:r>
+          </w:p>
+        </w:tc>
+        <w:tc>
+          <w:tcPr>
+            <w:tcW w:type="dxa" w:w="7020"/>
+          </w:tcPr>
+          <w:p>
+            <w:r>
+              <w:t>Sequential Least Squares Programming</w:t>
+            </w:r>
+          </w:p>
+        </w:tc>
+      </w:tr>
+      <w:tr>
+        <w:tc>
+          <w:tcPr>
+            <w:tcW w:type="dxa" w:w="2340"/>
+          </w:tcPr>
+          <w:p>
+            <w:r>
+              <w:t>ROC-AUC</w:t>
+            </w:r>
+          </w:p>
+        </w:tc>
+        <w:tc>
+          <w:tcPr>
+            <w:tcW w:type="dxa" w:w="7020"/>
+          </w:tcPr>
+          <w:p>
+            <w:r>
+              <w:t>Receiver Operating Characteristic - Area Under Curve</w:t>
+            </w:r>
+          </w:p>
+        </w:tc>
+      </w:tr>
+      <w:tr>
+        <w:tc>
+          <w:tcPr>
+            <w:tcW w:type="dxa" w:w="2340"/>
+          </w:tcPr>
+          <w:p>
+            <w:r>
+              <w:t>F1-Score</w:t>
+            </w:r>
+          </w:p>
+        </w:tc>
+        <w:tc>
+          <w:tcPr>
+            <w:tcW w:type="dxa" w:w="7020"/>
+          </w:tcPr>
+          <w:p>
+            <w:r>
+              <w:t>Harmonic Mean of Precision and Recall</w:t>
+            </w:r>
+          </w:p>
+        </w:tc>
+      </w:tr>
+      <w:tr>
+        <w:tc>
+          <w:tcPr>
+            <w:tcW w:type="dxa" w:w="2340"/>
+          </w:tcPr>
+          <w:p>
+            <w:r>
+              <w:t>MCC</w:t>
+            </w:r>
+          </w:p>
+        </w:tc>
+        <w:tc>
+          <w:tcPr>
+            <w:tcW w:type="dxa" w:w="7020"/>
+          </w:tcPr>
+          <w:p>
+            <w:r>
+              <w:t>Matthews Correlation Coefficient</w:t>
+            </w:r>
+          </w:p>
+        </w:tc>
+      </w:tr>
     </w:tbl>
     <w:p>
       <w:pPr>
@@ -8624,6 +8945,28 @@
           <w:p>
             <w:r>
               <w:t>0.3 (gated fusion), 0.2 (TCN)</w:t>
+            </w:r>
+          </w:p>
+        </w:tc>
+      </w:tr>
+      <w:tr>
+        <w:tc>
+          <w:tcPr>
+            <w:tcW w:type="dxa" w:w="4680"/>
+          </w:tcPr>
+          <w:p>
+            <w:r>
+              <w:t>Class Imbalance Handler</w:t>
+            </w:r>
+          </w:p>
+        </w:tc>
+        <w:tc>
+          <w:tcPr>
+            <w:tcW w:type="dxa" w:w="4680"/>
+          </w:tcPr>
+          <w:p>
+            <w:r>
+              <w:t>WeightedRandomSampler (10:1 ratio)</w:t>
             </w:r>
           </w:p>
         </w:tc>
@@ -9735,7 +10078,7 @@
           </w:tcPr>
           <w:p>
             <w:r>
-              <w:t>98.64%</w:t>
+              <w:t>98.05%</w:t>
             </w:r>
           </w:p>
         </w:tc>
@@ -9750,7 +10093,7 @@
           </w:tcPr>
           <w:p>
             <w:r>
-              <w:t>78.90%</w:t>
+              <w:t>84.31%</w:t>
             </w:r>
           </w:p>
         </w:tc>
@@ -9765,7 +10108,7 @@
           </w:tcPr>
           <w:p>
             <w:r>
-              <w:t>99.44%</w:t>
+              <w:t>94.22%</w:t>
             </w:r>
           </w:p>
         </w:tc>
@@ -9780,7 +10123,7 @@
           </w:tcPr>
           <w:p>
             <w:r>
-              <w:t>97.29%</w:t>
+              <w:t>91.01%</w:t>
             </w:r>
           </w:p>
         </w:tc>

</xml_diff>